<commit_message>
Ritat skärmbilder, uppdaterat dokumentationen och börjat på första html-sidan
</commit_message>
<xml_diff>
--- a/dokumentation/Projektplan_tidapp.docx
+++ b/dokumentation/Projektplan_tidapp.docx
@@ -1812,32 +1812,150 @@
     </w:p>
     <w:p>
       <w:r>
-        <w:t>Hur ska de olika skärmbilderna i programmet se ut</w:t>
-      </w:r>
-      <w:r>
-        <w:t>?</w:t>
+        <w:t>Aktiviteter:</w:t>
       </w:r>
     </w:p>
     <w:p>
+      <w:r>
+        <w:lastRenderedPageBreak/>
+        <w:drawing>
+          <wp:inline distT="0" distB="0" distL="0" distR="0" wp14:anchorId="1EC57CEE" wp14:editId="2E08E5B7">
+            <wp:extent cx="4182385" cy="2091193"/>
+            <wp:effectExtent l="0" t="0" r="8890" b="4445"/>
+            <wp:docPr id="1312564193" name="Bildobjekt 1"/>
+            <wp:cNvGraphicFramePr>
+              <a:graphicFrameLocks xmlns:a="http://schemas.openxmlformats.org/drawingml/2006/main" noChangeAspect="1"/>
+            </wp:cNvGraphicFramePr>
+            <a:graphic xmlns:a="http://schemas.openxmlformats.org/drawingml/2006/main">
+              <a:graphicData uri="http://schemas.openxmlformats.org/drawingml/2006/picture">
+                <pic:pic xmlns:pic="http://schemas.openxmlformats.org/drawingml/2006/picture">
+                  <pic:nvPicPr>
+                    <pic:cNvPr id="1312564193" name=""/>
+                    <pic:cNvPicPr/>
+                  </pic:nvPicPr>
+                  <pic:blipFill>
+                    <a:blip r:embed="rId13"/>
+                    <a:stretch>
+                      <a:fillRect/>
+                    </a:stretch>
+                  </pic:blipFill>
+                  <pic:spPr>
+                    <a:xfrm>
+                      <a:off x="0" y="0"/>
+                      <a:ext cx="4201272" cy="2100637"/>
+                    </a:xfrm>
+                    <a:prstGeom prst="rect">
+                      <a:avLst/>
+                    </a:prstGeom>
+                  </pic:spPr>
+                </pic:pic>
+              </a:graphicData>
+            </a:graphic>
+          </wp:inline>
+        </w:drawing>
+      </w:r>
+    </w:p>
+    <w:p>
+      <w:r>
+        <w:t>Uppgifter:</w:t>
+      </w:r>
+    </w:p>
+    <w:p>
+      <w:r>
+        <w:drawing>
+          <wp:inline distT="0" distB="0" distL="0" distR="0" wp14:anchorId="1AB2F03F" wp14:editId="417CB236">
+            <wp:extent cx="4118776" cy="2438440"/>
+            <wp:effectExtent l="0" t="0" r="0" b="0"/>
+            <wp:docPr id="563829690" name="Bildobjekt 1"/>
+            <wp:cNvGraphicFramePr>
+              <a:graphicFrameLocks xmlns:a="http://schemas.openxmlformats.org/drawingml/2006/main" noChangeAspect="1"/>
+            </wp:cNvGraphicFramePr>
+            <a:graphic xmlns:a="http://schemas.openxmlformats.org/drawingml/2006/main">
+              <a:graphicData uri="http://schemas.openxmlformats.org/drawingml/2006/picture">
+                <pic:pic xmlns:pic="http://schemas.openxmlformats.org/drawingml/2006/picture">
+                  <pic:nvPicPr>
+                    <pic:cNvPr id="563829690" name=""/>
+                    <pic:cNvPicPr/>
+                  </pic:nvPicPr>
+                  <pic:blipFill>
+                    <a:blip r:embed="rId14"/>
+                    <a:stretch>
+                      <a:fillRect/>
+                    </a:stretch>
+                  </pic:blipFill>
+                  <pic:spPr>
+                    <a:xfrm>
+                      <a:off x="0" y="0"/>
+                      <a:ext cx="4132842" cy="2446767"/>
+                    </a:xfrm>
+                    <a:prstGeom prst="rect">
+                      <a:avLst/>
+                    </a:prstGeom>
+                  </pic:spPr>
+                </pic:pic>
+              </a:graphicData>
+            </a:graphic>
+          </wp:inline>
+        </w:drawing>
+      </w:r>
+    </w:p>
+    <w:p>
+      <w:r>
+        <w:t>Sammanställning:</w:t>
+      </w:r>
+    </w:p>
+    <w:p>
+      <w:r>
+        <w:drawing>
+          <wp:inline distT="0" distB="0" distL="0" distR="0" wp14:anchorId="00501626" wp14:editId="2475E935">
+            <wp:extent cx="2003729" cy="2058305"/>
+            <wp:effectExtent l="0" t="0" r="0" b="0"/>
+            <wp:docPr id="903715353" name="Bildobjekt 1"/>
+            <wp:cNvGraphicFramePr>
+              <a:graphicFrameLocks xmlns:a="http://schemas.openxmlformats.org/drawingml/2006/main" noChangeAspect="1"/>
+            </wp:cNvGraphicFramePr>
+            <a:graphic xmlns:a="http://schemas.openxmlformats.org/drawingml/2006/main">
+              <a:graphicData uri="http://schemas.openxmlformats.org/drawingml/2006/picture">
+                <pic:pic xmlns:pic="http://schemas.openxmlformats.org/drawingml/2006/picture">
+                  <pic:nvPicPr>
+                    <pic:cNvPr id="903715353" name=""/>
+                    <pic:cNvPicPr/>
+                  </pic:nvPicPr>
+                  <pic:blipFill>
+                    <a:blip r:embed="rId15"/>
+                    <a:stretch>
+                      <a:fillRect/>
+                    </a:stretch>
+                  </pic:blipFill>
+                  <pic:spPr>
+                    <a:xfrm>
+                      <a:off x="0" y="0"/>
+                      <a:ext cx="2007764" cy="2062450"/>
+                    </a:xfrm>
+                    <a:prstGeom prst="rect">
+                      <a:avLst/>
+                    </a:prstGeom>
+                  </pic:spPr>
+                </pic:pic>
+              </a:graphicData>
+            </a:graphic>
+          </wp:inline>
+        </w:drawing>
+      </w:r>
+    </w:p>
+    <w:p>
       <w:pPr>
         <w:pStyle w:val="Rubrik2"/>
       </w:pPr>
       <w:bookmarkStart w:id="8" w:name="_Toc103152775"/>
       <w:r>
-        <w:lastRenderedPageBreak/>
         <w:t>Navigering</w:t>
       </w:r>
       <w:bookmarkEnd w:id="8"/>
     </w:p>
     <w:p>
       <w:r>
-        <w:t xml:space="preserve">Hur navigerar man mellan de olika bilderna </w:t>
-      </w:r>
-      <w:r>
-        <w:t>i programmet</w:t>
-      </w:r>
-      <w:r>
-        <w:t>?</w:t>
+        <w:t>Man navigerar mellan de olika vyerna genom att klicka på menyraden överst. Vill man ha en ny uppgift eller aktivitet klickar man på ”Ny”-knappen. Vill man redigera en befintlig klickar man på pennan och om man klickar på den röda bollen får man upp en fråga om man vill radera posten.</w:t>
       </w:r>
     </w:p>
     <w:p>
@@ -1846,6 +1964,7 @@
       </w:pPr>
       <w:bookmarkStart w:id="9" w:name="_Toc103152776"/>
       <w:r>
+        <w:lastRenderedPageBreak/>
         <w:t>Funktioner</w:t>
       </w:r>
       <w:bookmarkEnd w:id="9"/>
@@ -1904,7 +2023,7 @@
                     <pic:cNvPicPr/>
                   </pic:nvPicPr>
                   <pic:blipFill>
-                    <a:blip r:embed="rId13"/>
+                    <a:blip r:embed="rId16"/>
                     <a:stretch>
                       <a:fillRect/>
                     </a:stretch>
@@ -1983,7 +2102,6 @@
     </w:p>
     <w:p>
       <w:r>
-        <w:lastRenderedPageBreak/>
         <w:t>Databasen backupas med jämna mellanrum som en dump som också sparas i projektmappen.</w:t>
       </w:r>
     </w:p>
@@ -1993,6 +2111,7 @@
       </w:pPr>
       <w:bookmarkStart w:id="16" w:name="_Toc103152784"/>
       <w:r>
+        <w:lastRenderedPageBreak/>
         <w:t>Sekretess</w:t>
       </w:r>
       <w:bookmarkEnd w:id="16"/>
@@ -2008,7 +2127,7 @@
       </w:r>
     </w:p>
     <w:sectPr>
-      <w:footerReference w:type="default" r:id="rId14"/>
+      <w:footerReference w:type="default" r:id="rId17"/>
       <w:pgSz w:w="11906" w:h="16838" w:code="9"/>
       <w:pgMar w:top="1440" w:right="1639" w:bottom="1440" w:left="1639" w:header="720" w:footer="720" w:gutter="0"/>
       <w:pgNumType w:start="0"/>
@@ -4613,8 +4732,8 @@
   <w:rsids>
     <w:rsidRoot w:val="00BF00B4"/>
     <w:rsid w:val="001E75FC"/>
+    <w:rsid w:val="005E201C"/>
     <w:rsid w:val="007D257D"/>
-    <w:rsid w:val="008934E0"/>
     <w:rsid w:val="00BF00B4"/>
     <w:rsid w:val="00C061A4"/>
     <w:rsid w:val="00F5306C"/>

</xml_diff>